<commit_message>
feat: clean 1-line technical skills, straight left alignment, compact single-line project bullets, and Data Analyst & Analytics Engineer title
</commit_message>
<xml_diff>
--- a/frontend/public/resume/Gaurav_Data_Analyst_Resume.docx
+++ b/frontend/public/resume/Gaurav_Data_Analyst_Resume.docx
@@ -10,8 +10,8 @@
         <w:tblLook w:firstColumn="1" w:firstRow="1" w:lastColumn="0" w:lastRow="0" w:noHBand="0" w:noVBand="1" w:val="04A0"/>
       </w:tblPr>
       <w:tblGrid>
-        <w:gridCol w:w="5544"/>
-        <w:gridCol w:w="5544"/>
+        <w:gridCol w:w="5515"/>
+        <w:gridCol w:w="5515"/>
       </w:tblGrid>
       <w:tr>
         <w:tc>
@@ -25,7 +25,7 @@
             <w:r>
               <w:rPr>
                 <w:b/>
-                <w:color w:val="0F254A"/>
+                <w:color w:val="0B2545"/>
                 <w:sz w:val="40"/>
               </w:rPr>
               <w:t>Gaurav</w:t>
@@ -34,10 +34,10 @@
             <w:r>
               <w:rPr>
                 <w:b/>
-                <w:color w:val="0F172A"/>
+                <w:color w:val="1D4ED8"/>
                 <w:sz w:val="22"/>
               </w:rPr>
-              <w:t>Data Analyst</w:t>
+              <w:t>Data Analyst &amp; Analytics Engineer</w:t>
             </w:r>
           </w:p>
         </w:tc>
@@ -113,7 +113,7 @@
     </w:p>
     <w:p>
       <w:pPr>
-        <w:spacing w:before="80" w:after="40" w:line="240" w:lineRule="auto"/>
+        <w:spacing w:before="100" w:after="40" w:line="240" w:lineRule="auto"/>
         <w:pBdr>
           <w:bottom w:val="single" w:sz="6" w:space="2" w:color="0F172A"/>
         </w:pBdr>
@@ -130,13 +130,12 @@
     <w:p>
       <w:pPr>
         <w:spacing w:after="40" w:line="264" w:lineRule="auto"/>
-        <w:jc w:val="both"/>
       </w:pPr>
       <w:r>
         <w:rPr>
           <w:b/>
         </w:rPr>
-        <w:t>Data Analyst</w:t>
+        <w:t>Data Analyst &amp; Analytics Engineer</w:t>
       </w:r>
       <w:r>
         <w:t xml:space="preserve"> skilled in </w:t>
@@ -148,21 +147,21 @@
         <w:t>SQL, Python (Pandas, NumPy, Matplotlib, Seaborn), Power BI, and Advanced Excel</w:t>
       </w:r>
       <w:r>
-        <w:t xml:space="preserve"> with hands-on project experience in </w:t>
+        <w:t xml:space="preserve"> with hands-on experience in </w:t>
       </w:r>
       <w:r>
         <w:rPr>
           <w:b/>
         </w:rPr>
-        <w:t>data cleaning, ETL pipelines, Exploratory Data Analysis (EDA), and interactive dashboard design</w:t>
+        <w:t>data cleaning, ETL pipelines, Exploratory Data Analysis (EDA), and dashboard design</w:t>
       </w:r>
       <w:r>
-        <w:t>. Proficient in writing analytical SQL queries (Joins, Aggregations, Group By, Window Functions, CTEs), building Star-Schema relational data models in Power BI, and identifying meaningful trends from raw business datasets to drive data-backed decision-making.</w:t>
+        <w:t>. Proficient in writing analytical SQL queries (Joins, Aggregations, Window Functions, CTEs), building Star-Schema data models, and identifying meaningful trends from raw business datasets to support data-driven decision-making.</w:t>
       </w:r>
     </w:p>
     <w:p>
       <w:pPr>
-        <w:spacing w:before="80" w:after="40" w:line="240" w:lineRule="auto"/>
+        <w:spacing w:before="100" w:after="40" w:line="240" w:lineRule="auto"/>
         <w:pBdr>
           <w:bottom w:val="single" w:sz="6" w:space="2" w:color="0F172A"/>
         </w:pBdr>
@@ -183,8 +182,8 @@
         <w:tblLook w:firstColumn="1" w:firstRow="1" w:lastColumn="0" w:lastRow="0" w:noHBand="0" w:noVBand="1" w:val="04A0"/>
       </w:tblPr>
       <w:tblGrid>
-        <w:gridCol w:w="5544"/>
-        <w:gridCol w:w="5544"/>
+        <w:gridCol w:w="5515"/>
+        <w:gridCol w:w="5515"/>
       </w:tblGrid>
       <w:tr>
         <w:tc>
@@ -235,7 +234,6 @@
       <w:pPr>
         <w:spacing w:after="30" w:line="252" w:lineRule="auto"/>
         <w:ind w:left="259"/>
-        <w:jc w:val="both"/>
       </w:pPr>
       <w:r>
         <w:t>•  Tested and validated data flows, REST APIs, JSON payload schemas, and data pipelines to ensure cross-system data accuracy and consistency.</w:t>
@@ -245,7 +243,6 @@
       <w:pPr>
         <w:spacing w:after="30" w:line="252" w:lineRule="auto"/>
         <w:ind w:left="259"/>
-        <w:jc w:val="both"/>
       </w:pPr>
       <w:r>
         <w:t>•  Monitored automated workflow executions, performed root-cause analysis on data discrepancies, and documented findings to improve data reliability.</w:t>
@@ -258,8 +255,8 @@
         <w:tblLook w:firstColumn="1" w:firstRow="1" w:lastColumn="0" w:lastRow="0" w:noHBand="0" w:noVBand="1" w:val="04A0"/>
       </w:tblPr>
       <w:tblGrid>
-        <w:gridCol w:w="5544"/>
-        <w:gridCol w:w="5544"/>
+        <w:gridCol w:w="5515"/>
+        <w:gridCol w:w="5515"/>
       </w:tblGrid>
       <w:tr>
         <w:tc>
@@ -310,7 +307,6 @@
       <w:pPr>
         <w:spacing w:after="30" w:line="252" w:lineRule="auto"/>
         <w:ind w:left="259"/>
-        <w:jc w:val="both"/>
       </w:pPr>
       <w:r>
         <w:t>•  Leveraged Python (Pandas) and SQL for relational data extraction, cleaning, handling missing values, multi-table joins, and Exploratory Data Analysis (EDA).</w:t>
@@ -320,7 +316,6 @@
       <w:pPr>
         <w:spacing w:after="30" w:line="252" w:lineRule="auto"/>
         <w:ind w:left="259"/>
-        <w:jc w:val="both"/>
       </w:pPr>
       <w:r>
         <w:t>•  Built SQL analytical queries and summary tables, identifying key operational patterns to generate metric-driven insights for stakeholder reporting.</w:t>
@@ -328,7 +323,7 @@
     </w:p>
     <w:p>
       <w:pPr>
-        <w:spacing w:before="80" w:after="40" w:line="240" w:lineRule="auto"/>
+        <w:spacing w:before="100" w:after="40" w:line="240" w:lineRule="auto"/>
         <w:pBdr>
           <w:bottom w:val="single" w:sz="6" w:space="2" w:color="0F172A"/>
         </w:pBdr>
@@ -349,9 +344,9 @@
         <w:tblLook w:firstColumn="1" w:firstRow="1" w:lastColumn="0" w:lastRow="0" w:noHBand="0" w:noVBand="1" w:val="04A0"/>
       </w:tblPr>
       <w:tblGrid>
-        <w:gridCol w:w="3696"/>
-        <w:gridCol w:w="3696"/>
-        <w:gridCol w:w="3696"/>
+        <w:gridCol w:w="3677"/>
+        <w:gridCol w:w="3677"/>
+        <w:gridCol w:w="3677"/>
       </w:tblGrid>
       <w:tr>
         <w:tc>
@@ -365,7 +360,7 @@
             <w:r>
               <w:rPr>
                 <w:b/>
-                <w:sz w:val="16"/>
+                <w:sz w:val="17"/>
               </w:rPr>
               <w:t>Bachelor of Engineering: Chandigarh University, Gharuan</w:t>
             </w:r>
@@ -381,7 +376,7 @@
             </w:pPr>
             <w:r>
               <w:rPr>
-                <w:sz w:val="16"/>
+                <w:sz w:val="17"/>
               </w:rPr>
               <w:t>Aug 2021 – May 2025</w:t>
             </w:r>
@@ -399,7 +394,7 @@
             <w:r>
               <w:rPr>
                 <w:b/>
-                <w:sz w:val="16"/>
+                <w:sz w:val="17"/>
               </w:rPr>
               <w:t>CGPA: 7.87</w:t>
             </w:r>
@@ -417,7 +412,7 @@
             </w:pPr>
             <w:r>
               <w:rPr>
-                <w:sz w:val="16"/>
+                <w:sz w:val="17"/>
               </w:rPr>
               <w:t>Intermediate (HBSE): Barwala Public Sr. Sec. School, Hisar</w:t>
             </w:r>
@@ -433,7 +428,7 @@
             </w:pPr>
             <w:r>
               <w:rPr>
-                <w:sz w:val="16"/>
+                <w:sz w:val="17"/>
               </w:rPr>
               <w:t>Mar 2020</w:t>
             </w:r>
@@ -451,7 +446,7 @@
             <w:r>
               <w:rPr>
                 <w:b/>
-                <w:sz w:val="16"/>
+                <w:sz w:val="17"/>
               </w:rPr>
               <w:t>Percentage: 89%</w:t>
             </w:r>
@@ -469,7 +464,7 @@
             </w:pPr>
             <w:r>
               <w:rPr>
-                <w:sz w:val="16"/>
+                <w:sz w:val="17"/>
               </w:rPr>
               <w:t>Matriculation (CBSE): Army Public School, Hisar Cantt</w:t>
             </w:r>
@@ -485,7 +480,7 @@
             </w:pPr>
             <w:r>
               <w:rPr>
-                <w:sz w:val="16"/>
+                <w:sz w:val="17"/>
               </w:rPr>
               <w:t>Mar 2018</w:t>
             </w:r>
@@ -503,7 +498,7 @@
             <w:r>
               <w:rPr>
                 <w:b/>
-                <w:sz w:val="16"/>
+                <w:sz w:val="17"/>
               </w:rPr>
               <w:t>Percentage: 70.2%</w:t>
             </w:r>
@@ -513,7 +508,7 @@
     </w:tbl>
     <w:p>
       <w:pPr>
-        <w:spacing w:before="80" w:after="40" w:line="240" w:lineRule="auto"/>
+        <w:spacing w:before="100" w:after="40" w:line="240" w:lineRule="auto"/>
         <w:pBdr>
           <w:bottom w:val="single" w:sz="6" w:space="2" w:color="0F172A"/>
         </w:pBdr>
@@ -529,87 +524,83 @@
     </w:p>
     <w:p>
       <w:pPr>
-        <w:spacing w:after="24" w:line="252" w:lineRule="auto"/>
+        <w:spacing w:after="30" w:line="252" w:lineRule="auto"/>
         <w:ind w:left="259"/>
-        <w:jc w:val="both"/>
       </w:pPr>
       <w:r>
         <w:rPr>
           <w:b/>
-          <w:sz w:val="16"/>
+          <w:sz w:val="17"/>
         </w:rPr>
         <w:t>•  Programming &amp; Scripting:</w:t>
       </w:r>
       <w:r>
         <w:rPr>
-          <w:sz w:val="16"/>
+          <w:sz w:val="17"/>
         </w:rPr>
-        <w:t xml:space="preserve"> Python (Pandas, NumPy, Matplotlib, Seaborn), SQL, C++, Data Structures &amp; Algorithms (DSA)</w:t>
+        <w:t xml:space="preserve"> Python (Pandas, NumPy, Matplotlib, Seaborn), SQL, PostgreSQL, SQLite</w:t>
       </w:r>
     </w:p>
     <w:p>
       <w:pPr>
-        <w:spacing w:after="24" w:line="252" w:lineRule="auto"/>
+        <w:spacing w:after="30" w:line="252" w:lineRule="auto"/>
         <w:ind w:left="259"/>
-        <w:jc w:val="both"/>
       </w:pPr>
       <w:r>
         <w:rPr>
           <w:b/>
-          <w:sz w:val="16"/>
+          <w:sz w:val="17"/>
         </w:rPr>
         <w:t>•  Data Analytics &amp; BI:</w:t>
       </w:r>
       <w:r>
         <w:rPr>
-          <w:sz w:val="16"/>
+          <w:sz w:val="17"/>
         </w:rPr>
-        <w:t xml:space="preserve"> Power BI Desktop, DAX Measures, Star Schema Data Modeling, Tableau Desktop, Advanced Excel (VLOOKUP, Pivot Tables, Power Query)</w:t>
+        <w:t xml:space="preserve"> Power BI (DAX Measures, Data Modeling), Tableau Desktop, Advanced Excel (VLOOKUP, Pivot Tables)</w:t>
       </w:r>
     </w:p>
     <w:p>
       <w:pPr>
-        <w:spacing w:after="24" w:line="252" w:lineRule="auto"/>
+        <w:spacing w:after="30" w:line="252" w:lineRule="auto"/>
         <w:ind w:left="259"/>
-        <w:jc w:val="both"/>
       </w:pPr>
       <w:r>
         <w:rPr>
           <w:b/>
-          <w:sz w:val="16"/>
+          <w:sz w:val="17"/>
         </w:rPr>
         <w:t>•  Databases &amp; Querying:</w:t>
       </w:r>
       <w:r>
         <w:rPr>
-          <w:sz w:val="16"/>
+          <w:sz w:val="17"/>
         </w:rPr>
-        <w:t xml:space="preserve"> PostgreSQL, SQLite, MySQL, Relational Database Design, Joins, Aggregations, Group By, Subqueries, CTEs, Window Functions</w:t>
+        <w:t xml:space="preserve"> PostgreSQL, MySQL, SQLite, Joins, Aggregations, Group By, Subqueries, Window Functions, CTEs</w:t>
       </w:r>
     </w:p>
     <w:p>
       <w:pPr>
-        <w:spacing w:after="24" w:line="252" w:lineRule="auto"/>
+        <w:spacing w:after="30" w:line="252" w:lineRule="auto"/>
         <w:ind w:left="259"/>
-        <w:jc w:val="both"/>
       </w:pPr>
       <w:r>
         <w:rPr>
           <w:b/>
-          <w:sz w:val="16"/>
+          <w:sz w:val="17"/>
         </w:rPr>
         <w:t>•  Analytics Concepts &amp; Tools:</w:t>
       </w:r>
       <w:r>
         <w:rPr>
-          <w:sz w:val="16"/>
+          <w:sz w:val="17"/>
         </w:rPr>
-        <w:t xml:space="preserve"> Data Cleaning, Exploratory Data Analysis (EDA), ETL Pipelines, Data Validation, Jupyter Notebook, Git, GitHub, VS Code</w:t>
+        <w:t xml:space="preserve"> Data Cleaning, ETL Pipelines, Exploratory Data Analysis (EDA), Jupyter Notebook, Git, GitHub, VS Code</w:t>
       </w:r>
     </w:p>
     <w:p>
       <w:pPr>
-        <w:spacing w:before="80" w:after="40" w:line="240" w:lineRule="auto"/>
+        <w:spacing w:before="100" w:after="40" w:line="240" w:lineRule="auto"/>
         <w:pBdr>
           <w:bottom w:val="single" w:sz="6" w:space="2" w:color="0F172A"/>
         </w:pBdr>
@@ -630,8 +621,8 @@
         <w:tblLook w:firstColumn="1" w:firstRow="1" w:lastColumn="0" w:lastRow="0" w:noHBand="0" w:noVBand="1" w:val="04A0"/>
       </w:tblPr>
       <w:tblGrid>
-        <w:gridCol w:w="5544"/>
-        <w:gridCol w:w="5544"/>
+        <w:gridCol w:w="5515"/>
+        <w:gridCol w:w="5515"/>
       </w:tblGrid>
       <w:tr>
         <w:tc>
@@ -691,20 +682,18 @@
       <w:pPr>
         <w:spacing w:after="30" w:line="252" w:lineRule="auto"/>
         <w:ind w:left="259"/>
-        <w:jc w:val="both"/>
       </w:pPr>
       <w:r>
-        <w:t>•  Performed end-to-end data cleaning, EDA, and PostgreSQL schema modeling on 31,000+ transaction records to analyze product revenue and customer orders.</w:t>
+        <w:t>•  Cleaned &amp; analyzed 31,000+ sales transactions ($8.35M GMV) to evaluate customer orders, revenue trends, and product performance.</w:t>
       </w:r>
     </w:p>
     <w:p>
       <w:pPr>
         <w:spacing w:after="30" w:line="252" w:lineRule="auto"/>
         <w:ind w:left="259"/>
-        <w:jc w:val="both"/>
       </w:pPr>
       <w:r>
-        <w:t>•  Designed an interactive Power BI dashboard with DAX measures (YTD Revenue, MoM Growth %, AOV) and analyzed discount impacts on gross margins.</w:t>
+        <w:t>•  Built an interactive Power BI dashboard with 25+ DAX measures (YTD Revenue, MoM Growth %, AOV) tracking discount margin impacts.</w:t>
       </w:r>
     </w:p>
     <w:tbl>
@@ -714,8 +703,8 @@
         <w:tblLook w:firstColumn="1" w:firstRow="1" w:lastColumn="0" w:lastRow="0" w:noHBand="0" w:noVBand="1" w:val="04A0"/>
       </w:tblPr>
       <w:tblGrid>
-        <w:gridCol w:w="5544"/>
-        <w:gridCol w:w="5544"/>
+        <w:gridCol w:w="5515"/>
+        <w:gridCol w:w="5515"/>
       </w:tblGrid>
       <w:tr>
         <w:tc>
@@ -775,20 +764,18 @@
       <w:pPr>
         <w:spacing w:after="30" w:line="252" w:lineRule="auto"/>
         <w:ind w:left="259"/>
-        <w:jc w:val="both"/>
       </w:pPr>
       <w:r>
-        <w:t>•  Analyzed 8,700+ production shift records (3.2M+ manufactured units) to evaluate machine downtime causes, scrap rates, and Overall Equipment Effectiveness (OEE).</w:t>
+        <w:t>•  Analyzed 8,700+ production shift records (3.2M+ units) to evaluate machine downtime, defect scrap rates, and plant OEE efficiency.</w:t>
       </w:r>
     </w:p>
     <w:p>
       <w:pPr>
         <w:spacing w:after="30" w:line="252" w:lineRule="auto"/>
         <w:ind w:left="259"/>
-        <w:jc w:val="both"/>
       </w:pPr>
       <w:r>
-        <w:t>•  Used Python &amp; SQL for Pareto downtime analysis and correlation checks between machine vibration/temperature and defect generation; built Power BI plant KPI reports.</w:t>
+        <w:t>•  Conducted Pareto downtime analysis and correlated vibration/temperature spikes with scrap defects; built Power BI plant KPI reports.</w:t>
       </w:r>
     </w:p>
     <w:tbl>
@@ -798,8 +785,8 @@
         <w:tblLook w:firstColumn="1" w:firstRow="1" w:lastColumn="0" w:lastRow="0" w:noHBand="0" w:noVBand="1" w:val="04A0"/>
       </w:tblPr>
       <w:tblGrid>
-        <w:gridCol w:w="5544"/>
-        <w:gridCol w:w="5544"/>
+        <w:gridCol w:w="5515"/>
+        <w:gridCol w:w="5515"/>
       </w:tblGrid>
       <w:tr>
         <w:tc>
@@ -859,20 +846,18 @@
       <w:pPr>
         <w:spacing w:after="30" w:line="252" w:lineRule="auto"/>
         <w:ind w:left="259"/>
-        <w:jc w:val="both"/>
       </w:pPr>
       <w:r>
-        <w:t>•  Analyzed 25,000 subscriber records to evaluate customer churn drivers, tenure trends, contract types, and support ticket frequency impact on retention.</w:t>
+        <w:t>•  Analyzed 25,000 subscriber records to identify key churn drivers, contract renewal patterns, support ticket impact, and retention metrics.</w:t>
       </w:r>
     </w:p>
     <w:p>
       <w:pPr>
         <w:spacing w:after="30" w:line="252" w:lineRule="auto"/>
         <w:ind w:left="259"/>
-        <w:jc w:val="both"/>
       </w:pPr>
       <w:r>
-        <w:t>•  Created monthly cohort retention matrices and built a Power BI dashboard tracking revenue-at-risk and customer segmentation KPIs.</w:t>
+        <w:t>•  Created monthly cohort retention matrices and built Power BI retention dashboards protecting $8.14M in Annualized Revenue at Risk.</w:t>
       </w:r>
     </w:p>
     <w:tbl>
@@ -882,8 +867,8 @@
         <w:tblLook w:firstColumn="1" w:firstRow="1" w:lastColumn="0" w:lastRow="0" w:noHBand="0" w:noVBand="1" w:val="04A0"/>
       </w:tblPr>
       <w:tblGrid>
-        <w:gridCol w:w="5544"/>
-        <w:gridCol w:w="5544"/>
+        <w:gridCol w:w="5515"/>
+        <w:gridCol w:w="5515"/>
       </w:tblGrid>
       <w:tr>
         <w:tc>
@@ -943,25 +928,23 @@
       <w:pPr>
         <w:spacing w:after="30" w:line="252" w:lineRule="auto"/>
         <w:ind w:left="259"/>
-        <w:jc w:val="both"/>
       </w:pPr>
       <w:r>
-        <w:t>•  Developed a spreadsheet automation web application enabling users to upload, preview, validate, clean, and process tabular datasets (Excel/CSV) with instant browser rendering.</w:t>
+        <w:t>•  Developed a full-stack spreadsheet analytics tool to upload, validate, clean, and process tabular datasets (Excel/CSV) in real time.</w:t>
       </w:r>
     </w:p>
     <w:p>
       <w:pPr>
         <w:spacing w:after="30" w:line="252" w:lineRule="auto"/>
         <w:ind w:left="259"/>
-        <w:jc w:val="both"/>
       </w:pPr>
       <w:r>
-        <w:t>•  Built FastAPI backend endpoints integrated with Pandas and PostgreSQL for automated data validation, transformation, and structured CSV/PDF report exports.</w:t>
+        <w:t>•  Engineered asynchronous FastAPI endpoints with Pandas and PostgreSQL for automated ETL data validation and dynamic CSV/PDF report exports.</w:t>
       </w:r>
     </w:p>
     <w:p>
       <w:pPr>
-        <w:spacing w:before="80" w:after="40" w:line="240" w:lineRule="auto"/>
+        <w:spacing w:before="100" w:after="40" w:line="240" w:lineRule="auto"/>
         <w:pBdr>
           <w:bottom w:val="single" w:sz="6" w:space="2" w:color="0F172A"/>
         </w:pBdr>
@@ -977,55 +960,55 @@
     </w:p>
     <w:p>
       <w:pPr>
-        <w:spacing w:after="24" w:line="252" w:lineRule="auto"/>
+        <w:spacing w:after="30" w:line="252" w:lineRule="auto"/>
         <w:ind w:left="259"/>
       </w:pPr>
       <w:r>
         <w:rPr>
-          <w:sz w:val="16"/>
+          <w:sz w:val="17"/>
         </w:rPr>
         <w:t>•  IBM Data Science Professional Specialization (16-Course Specialization Track) – IBM / Coursera</w:t>
       </w:r>
     </w:p>
     <w:p>
       <w:pPr>
-        <w:spacing w:after="24" w:line="252" w:lineRule="auto"/>
+        <w:spacing w:after="30" w:line="252" w:lineRule="auto"/>
         <w:ind w:left="259"/>
       </w:pPr>
       <w:r>
         <w:rPr>
-          <w:sz w:val="16"/>
+          <w:sz w:val="17"/>
         </w:rPr>
         <w:t>•  Data Visualization with Tableau Specialization (6-Course Specialization Track) – UC Davis / Coursera</w:t>
       </w:r>
     </w:p>
     <w:p>
       <w:pPr>
-        <w:spacing w:after="24" w:line="252" w:lineRule="auto"/>
+        <w:spacing w:after="30" w:line="252" w:lineRule="auto"/>
         <w:ind w:left="259"/>
       </w:pPr>
       <w:r>
         <w:rPr>
-          <w:sz w:val="16"/>
+          <w:sz w:val="17"/>
         </w:rPr>
         <w:t>•  Python for Data Science Professional Certificate – IBM / Coursera</w:t>
       </w:r>
     </w:p>
     <w:p>
       <w:pPr>
-        <w:spacing w:after="24" w:line="252" w:lineRule="auto"/>
+        <w:spacing w:after="30" w:line="252" w:lineRule="auto"/>
         <w:ind w:left="259"/>
       </w:pPr>
       <w:r>
         <w:rPr>
-          <w:sz w:val="16"/>
+          <w:sz w:val="17"/>
         </w:rPr>
         <w:t>•  Probability and Statistics for Data Analytics – IIT Kharagpur (NPTEL, India)</w:t>
       </w:r>
     </w:p>
     <w:sectPr>
       <w:pgSz w:w="12240" w:h="15840"/>
-      <w:pgMar w:top="504" w:right="576" w:bottom="504" w:left="576" w:header="720" w:footer="720" w:gutter="0"/>
+      <w:pgMar w:top="504" w:right="605" w:bottom="504" w:left="605" w:header="720" w:footer="720" w:gutter="0"/>
       <w:cols w:space="720"/>
       <w:docGrid w:linePitch="360"/>
     </w:sectPr>

</xml_diff>

<commit_message>
feat: incorporate QA & API Testing skills, restore exact Composio tool validation bullets, and lock pixel-perfect left margin
</commit_message>
<xml_diff>
--- a/frontend/public/resume/Gaurav_Data_Analyst_Resume.docx
+++ b/frontend/public/resume/Gaurav_Data_Analyst_Resume.docx
@@ -153,10 +153,10 @@
         <w:rPr>
           <w:b/>
         </w:rPr>
-        <w:t>data cleaning, ETL pipelines, Exploratory Data Analysis (EDA), and dashboard design</w:t>
+        <w:t>data cleaning, ETL pipelines, Exploratory Data Analysis (EDA), API validation, and dashboard design</w:t>
       </w:r>
       <w:r>
-        <w:t>. Proficient in writing analytical SQL queries (Joins, Aggregations, Window Functions, CTEs), building Star-Schema data models, and identifying meaningful trends from raw business datasets to support data-driven decision-making.</w:t>
+        <w:t>. Proficient in writing analytical SQL queries (Joins, Aggregations, Window Functions, CTEs), building Star-Schema data models, and testing data workflows to ensure cross-system data integrity and support metric-driven decision-making.</w:t>
       </w:r>
     </w:p>
     <w:p>
@@ -236,7 +236,7 @@
         <w:ind w:left="259"/>
       </w:pPr>
       <w:r>
-        <w:t>•  Tested and validated data flows, REST APIs, JSON payload schemas, and data pipelines to ensure cross-system data accuracy and consistency.</w:t>
+        <w:t>•  Tested and validated REST APIs, OAuth2 authentication flows, webhooks, and event-driven data integrations; verified JSON payload schemas and cross-system data consistency.</w:t>
       </w:r>
     </w:p>
     <w:p>
@@ -245,7 +245,7 @@
         <w:ind w:left="259"/>
       </w:pPr>
       <w:r>
-        <w:t>•  Monitored automated workflow executions, performed root-cause analysis on data discrepancies, and documented findings to improve data reliability.</w:t>
+        <w:t>•  Monitored microservice workflow executions, performed root-cause analysis on data pipeline failures, and designed comprehensive Postman test suites to ensure data reliability.</w:t>
       </w:r>
     </w:p>
     <w:tbl>
@@ -589,13 +589,13 @@
           <w:b/>
           <w:sz w:val="17"/>
         </w:rPr>
-        <w:t>•  Analytics Concepts &amp; Tools:</w:t>
+        <w:t>•  Validation, Testing &amp; Tools:</w:t>
       </w:r>
       <w:r>
         <w:rPr>
           <w:sz w:val="17"/>
         </w:rPr>
-        <w:t xml:space="preserve"> Data Cleaning, ETL Pipelines, Exploratory Data Analysis (EDA), Jupyter Notebook, Git, GitHub, VS Code</w:t>
+        <w:t xml:space="preserve"> Data Cleaning, ETL Pipelines, EDA, API Testing (Postman), JSON Schema Validation, GitHub, Jupyter Notebook</w:t>
       </w:r>
     </w:p>
     <w:p>

</xml_diff>

<commit_message>
feat: expand vertical spacing, enlarge fonts, and eliminate all bottom white space on single-page Data Analyst resume
</commit_message>
<xml_diff>
--- a/frontend/public/resume/Gaurav_Data_Analyst_Resume.docx
+++ b/frontend/public/resume/Gaurav_Data_Analyst_Resume.docx
@@ -10,13 +10,13 @@
         <w:tblLook w:firstColumn="1" w:firstRow="1" w:lastColumn="0" w:lastRow="0" w:noHBand="0" w:noVBand="1" w:val="04A0"/>
       </w:tblPr>
       <w:tblGrid>
-        <w:gridCol w:w="5515"/>
-        <w:gridCol w:w="5515"/>
+        <w:gridCol w:w="5544"/>
+        <w:gridCol w:w="5544"/>
       </w:tblGrid>
       <w:tr>
         <w:tc>
           <w:tcPr>
-            <w:tcW w:type="dxa" w:w="6480"/>
+            <w:tcW w:type="dxa" w:w="6624"/>
           </w:tcPr>
           <w:p>
             <w:pPr>
@@ -26,7 +26,7 @@
               <w:rPr>
                 <w:b/>
                 <w:color w:val="0B2545"/>
-                <w:sz w:val="40"/>
+                <w:sz w:val="42"/>
               </w:rPr>
               <w:t>Gaurav</w:t>
               <w:br/>
@@ -43,7 +43,7 @@
         </w:tc>
         <w:tc>
           <w:tcPr>
-            <w:tcW w:type="dxa" w:w="4608"/>
+            <w:tcW w:type="dxa" w:w="4464"/>
           </w:tcPr>
           <w:p>
             <w:pPr>
@@ -72,7 +72,7 @@
     </w:tbl>
     <w:p>
       <w:pPr>
-        <w:spacing w:before="40" w:after="40" w:line="240" w:lineRule="auto"/>
+        <w:spacing w:before="60" w:after="40" w:line="240" w:lineRule="auto"/>
       </w:pPr>
       <w:r>
         <w:t xml:space="preserve">+91 8307042798  |  </w:t>
@@ -113,7 +113,7 @@
     </w:p>
     <w:p>
       <w:pPr>
-        <w:spacing w:before="100" w:after="40" w:line="240" w:lineRule="auto"/>
+        <w:spacing w:before="120" w:after="50" w:line="240" w:lineRule="auto"/>
         <w:pBdr>
           <w:bottom w:val="single" w:sz="6" w:space="2" w:color="0F172A"/>
         </w:pBdr>
@@ -122,14 +122,14 @@
         <w:rPr>
           <w:b/>
           <w:color w:val="0F172A"/>
-          <w:sz w:val="20"/>
+          <w:sz w:val="21"/>
         </w:rPr>
         <w:t>Professional Summary</w:t>
       </w:r>
     </w:p>
     <w:p>
       <w:pPr>
-        <w:spacing w:after="40" w:line="264" w:lineRule="auto"/>
+        <w:spacing w:after="60" w:line="276" w:lineRule="auto"/>
       </w:pPr>
       <w:r>
         <w:rPr>
@@ -161,7 +161,7 @@
     </w:p>
     <w:p>
       <w:pPr>
-        <w:spacing w:before="100" w:after="40" w:line="240" w:lineRule="auto"/>
+        <w:spacing w:before="120" w:after="50" w:line="240" w:lineRule="auto"/>
         <w:pBdr>
           <w:bottom w:val="single" w:sz="6" w:space="2" w:color="0F172A"/>
         </w:pBdr>
@@ -170,7 +170,7 @@
         <w:rPr>
           <w:b/>
           <w:color w:val="0F172A"/>
-          <w:sz w:val="20"/>
+          <w:sz w:val="21"/>
         </w:rPr>
         <w:t>Professional Experience</w:t>
       </w:r>
@@ -182,8 +182,8 @@
         <w:tblLook w:firstColumn="1" w:firstRow="1" w:lastColumn="0" w:lastRow="0" w:noHBand="0" w:noVBand="1" w:val="04A0"/>
       </w:tblPr>
       <w:tblGrid>
-        <w:gridCol w:w="5515"/>
-        <w:gridCol w:w="5515"/>
+        <w:gridCol w:w="5544"/>
+        <w:gridCol w:w="5544"/>
       </w:tblGrid>
       <w:tr>
         <w:tc>
@@ -197,14 +197,14 @@
             <w:r>
               <w:rPr>
                 <w:b/>
-                <w:sz w:val="17"/>
+                <w:sz w:val="18"/>
               </w:rPr>
               <w:t>Composio Technologies Private Limited</w:t>
             </w:r>
             <w:r>
               <w:rPr>
                 <w:i/>
-                <w:sz w:val="17"/>
+                <w:sz w:val="18"/>
               </w:rPr>
               <w:t xml:space="preserve"> – QA / Data Validation &amp; Engineering</w:t>
             </w:r>
@@ -232,7 +232,7 @@
     </w:tbl>
     <w:p>
       <w:pPr>
-        <w:spacing w:after="30" w:line="252" w:lineRule="auto"/>
+        <w:spacing w:after="40" w:line="264" w:lineRule="auto"/>
         <w:ind w:left="259"/>
       </w:pPr>
       <w:r>
@@ -241,7 +241,7 @@
     </w:p>
     <w:p>
       <w:pPr>
-        <w:spacing w:after="30" w:line="252" w:lineRule="auto"/>
+        <w:spacing w:after="40" w:line="264" w:lineRule="auto"/>
         <w:ind w:left="259"/>
       </w:pPr>
       <w:r>
@@ -255,8 +255,8 @@
         <w:tblLook w:firstColumn="1" w:firstRow="1" w:lastColumn="0" w:lastRow="0" w:noHBand="0" w:noVBand="1" w:val="04A0"/>
       </w:tblPr>
       <w:tblGrid>
-        <w:gridCol w:w="5515"/>
-        <w:gridCol w:w="5515"/>
+        <w:gridCol w:w="5544"/>
+        <w:gridCol w:w="5544"/>
       </w:tblGrid>
       <w:tr>
         <w:tc>
@@ -270,14 +270,14 @@
             <w:r>
               <w:rPr>
                 <w:b/>
-                <w:sz w:val="17"/>
+                <w:sz w:val="18"/>
               </w:rPr>
               <w:t>MuSigma Inc.</w:t>
             </w:r>
             <w:r>
               <w:rPr>
                 <w:i/>
-                <w:sz w:val="17"/>
+                <w:sz w:val="18"/>
               </w:rPr>
               <w:t xml:space="preserve"> – Trainee Decision Scientist / Data Analyst</w:t>
             </w:r>
@@ -305,7 +305,7 @@
     </w:tbl>
     <w:p>
       <w:pPr>
-        <w:spacing w:after="30" w:line="252" w:lineRule="auto"/>
+        <w:spacing w:after="40" w:line="264" w:lineRule="auto"/>
         <w:ind w:left="259"/>
       </w:pPr>
       <w:r>
@@ -314,7 +314,7 @@
     </w:p>
     <w:p>
       <w:pPr>
-        <w:spacing w:after="30" w:line="252" w:lineRule="auto"/>
+        <w:spacing w:after="40" w:line="264" w:lineRule="auto"/>
         <w:ind w:left="259"/>
       </w:pPr>
       <w:r>
@@ -323,7 +323,7 @@
     </w:p>
     <w:p>
       <w:pPr>
-        <w:spacing w:before="100" w:after="40" w:line="240" w:lineRule="auto"/>
+        <w:spacing w:before="120" w:after="50" w:line="240" w:lineRule="auto"/>
         <w:pBdr>
           <w:bottom w:val="single" w:sz="6" w:space="2" w:color="0F172A"/>
         </w:pBdr>
@@ -332,7 +332,7 @@
         <w:rPr>
           <w:b/>
           <w:color w:val="0F172A"/>
-          <w:sz w:val="20"/>
+          <w:sz w:val="21"/>
         </w:rPr>
         <w:t>Education</w:t>
       </w:r>
@@ -344,9 +344,9 @@
         <w:tblLook w:firstColumn="1" w:firstRow="1" w:lastColumn="0" w:lastRow="0" w:noHBand="0" w:noVBand="1" w:val="04A0"/>
       </w:tblPr>
       <w:tblGrid>
-        <w:gridCol w:w="3677"/>
-        <w:gridCol w:w="3677"/>
-        <w:gridCol w:w="3677"/>
+        <w:gridCol w:w="3696"/>
+        <w:gridCol w:w="3696"/>
+        <w:gridCol w:w="3696"/>
       </w:tblGrid>
       <w:tr>
         <w:tc>
@@ -355,7 +355,7 @@
           </w:tcPr>
           <w:p>
             <w:pPr>
-              <w:spacing w:after="10"/>
+              <w:spacing w:after="20"/>
             </w:pPr>
             <w:r>
               <w:rPr>
@@ -372,7 +372,7 @@
           </w:tcPr>
           <w:p>
             <w:pPr>
-              <w:spacing w:after="10"/>
+              <w:spacing w:after="20"/>
             </w:pPr>
             <w:r>
               <w:rPr>
@@ -388,7 +388,7 @@
           </w:tcPr>
           <w:p>
             <w:pPr>
-              <w:spacing w:after="10"/>
+              <w:spacing w:after="20"/>
               <w:jc w:val="right"/>
             </w:pPr>
             <w:r>
@@ -408,7 +408,7 @@
           </w:tcPr>
           <w:p>
             <w:pPr>
-              <w:spacing w:after="10"/>
+              <w:spacing w:after="20"/>
             </w:pPr>
             <w:r>
               <w:rPr>
@@ -424,7 +424,7 @@
           </w:tcPr>
           <w:p>
             <w:pPr>
-              <w:spacing w:after="10"/>
+              <w:spacing w:after="20"/>
             </w:pPr>
             <w:r>
               <w:rPr>
@@ -440,7 +440,7 @@
           </w:tcPr>
           <w:p>
             <w:pPr>
-              <w:spacing w:after="10"/>
+              <w:spacing w:after="20"/>
               <w:jc w:val="right"/>
             </w:pPr>
             <w:r>
@@ -460,7 +460,7 @@
           </w:tcPr>
           <w:p>
             <w:pPr>
-              <w:spacing w:after="10"/>
+              <w:spacing w:after="20"/>
             </w:pPr>
             <w:r>
               <w:rPr>
@@ -476,7 +476,7 @@
           </w:tcPr>
           <w:p>
             <w:pPr>
-              <w:spacing w:after="10"/>
+              <w:spacing w:after="20"/>
             </w:pPr>
             <w:r>
               <w:rPr>
@@ -492,7 +492,7 @@
           </w:tcPr>
           <w:p>
             <w:pPr>
-              <w:spacing w:after="10"/>
+              <w:spacing w:after="20"/>
               <w:jc w:val="right"/>
             </w:pPr>
             <w:r>
@@ -508,7 +508,7 @@
     </w:tbl>
     <w:p>
       <w:pPr>
-        <w:spacing w:before="100" w:after="40" w:line="240" w:lineRule="auto"/>
+        <w:spacing w:before="120" w:after="50" w:line="240" w:lineRule="auto"/>
         <w:pBdr>
           <w:bottom w:val="single" w:sz="6" w:space="2" w:color="0F172A"/>
         </w:pBdr>
@@ -517,14 +517,14 @@
         <w:rPr>
           <w:b/>
           <w:color w:val="0F172A"/>
-          <w:sz w:val="20"/>
+          <w:sz w:val="21"/>
         </w:rPr>
         <w:t>Technical Skills</w:t>
       </w:r>
     </w:p>
     <w:p>
       <w:pPr>
-        <w:spacing w:after="30" w:line="252" w:lineRule="auto"/>
+        <w:spacing w:after="40" w:line="264" w:lineRule="auto"/>
         <w:ind w:left="259"/>
       </w:pPr>
       <w:r>
@@ -543,7 +543,7 @@
     </w:p>
     <w:p>
       <w:pPr>
-        <w:spacing w:after="30" w:line="252" w:lineRule="auto"/>
+        <w:spacing w:after="40" w:line="264" w:lineRule="auto"/>
         <w:ind w:left="259"/>
       </w:pPr>
       <w:r>
@@ -562,7 +562,7 @@
     </w:p>
     <w:p>
       <w:pPr>
-        <w:spacing w:after="30" w:line="252" w:lineRule="auto"/>
+        <w:spacing w:after="40" w:line="264" w:lineRule="auto"/>
         <w:ind w:left="259"/>
       </w:pPr>
       <w:r>
@@ -581,7 +581,7 @@
     </w:p>
     <w:p>
       <w:pPr>
-        <w:spacing w:after="30" w:line="252" w:lineRule="auto"/>
+        <w:spacing w:after="40" w:line="264" w:lineRule="auto"/>
         <w:ind w:left="259"/>
       </w:pPr>
       <w:r>
@@ -595,12 +595,12 @@
         <w:rPr>
           <w:sz w:val="17"/>
         </w:rPr>
-        <w:t xml:space="preserve"> Data Cleaning, ETL Pipelines, EDA, API Testing (Postman), JSON Schema Validation, GitHub, Jupyter Notebook</w:t>
+        <w:t xml:space="preserve"> Data Cleaning, ETL Pipelines, EDA, API Testing (Postman), JSON Schemas, GitHub, Jupyter</w:t>
       </w:r>
     </w:p>
     <w:p>
       <w:pPr>
-        <w:spacing w:before="100" w:after="40" w:line="240" w:lineRule="auto"/>
+        <w:spacing w:before="120" w:after="50" w:line="240" w:lineRule="auto"/>
         <w:pBdr>
           <w:bottom w:val="single" w:sz="6" w:space="2" w:color="0F172A"/>
         </w:pBdr>
@@ -609,7 +609,7 @@
         <w:rPr>
           <w:b/>
           <w:color w:val="0F172A"/>
-          <w:sz w:val="20"/>
+          <w:sz w:val="21"/>
         </w:rPr>
         <w:t>Projects</w:t>
       </w:r>
@@ -621,8 +621,8 @@
         <w:tblLook w:firstColumn="1" w:firstRow="1" w:lastColumn="0" w:lastRow="0" w:noHBand="0" w:noVBand="1" w:val="04A0"/>
       </w:tblPr>
       <w:tblGrid>
-        <w:gridCol w:w="5515"/>
-        <w:gridCol w:w="5515"/>
+        <w:gridCol w:w="5544"/>
+        <w:gridCol w:w="5544"/>
       </w:tblGrid>
       <w:tr>
         <w:tc>
@@ -636,7 +636,7 @@
             <w:r>
               <w:rPr>
                 <w:b/>
-                <w:sz w:val="17"/>
+                <w:sz w:val="18"/>
               </w:rPr>
               <w:t>•  E-Commerce Sales &amp; Customer Analytics</w:t>
             </w:r>
@@ -666,7 +666,7 @@
     </w:tbl>
     <w:p>
       <w:pPr>
-        <w:spacing w:after="20"/>
+        <w:spacing w:after="30"/>
         <w:ind w:left="259"/>
       </w:pPr>
       <w:r>
@@ -680,7 +680,7 @@
     </w:p>
     <w:p>
       <w:pPr>
-        <w:spacing w:after="30" w:line="252" w:lineRule="auto"/>
+        <w:spacing w:after="40" w:line="264" w:lineRule="auto"/>
         <w:ind w:left="259"/>
       </w:pPr>
       <w:r>
@@ -689,7 +689,7 @@
     </w:p>
     <w:p>
       <w:pPr>
-        <w:spacing w:after="30" w:line="252" w:lineRule="auto"/>
+        <w:spacing w:after="40" w:line="264" w:lineRule="auto"/>
         <w:ind w:left="259"/>
       </w:pPr>
       <w:r>
@@ -703,8 +703,8 @@
         <w:tblLook w:firstColumn="1" w:firstRow="1" w:lastColumn="0" w:lastRow="0" w:noHBand="0" w:noVBand="1" w:val="04A0"/>
       </w:tblPr>
       <w:tblGrid>
-        <w:gridCol w:w="5515"/>
-        <w:gridCol w:w="5515"/>
+        <w:gridCol w:w="5544"/>
+        <w:gridCol w:w="5544"/>
       </w:tblGrid>
       <w:tr>
         <w:tc>
@@ -718,7 +718,7 @@
             <w:r>
               <w:rPr>
                 <w:b/>
-                <w:sz w:val="17"/>
+                <w:sz w:val="18"/>
               </w:rPr>
               <w:t>•  Manufacturing Quality &amp; Operations Analytics</w:t>
             </w:r>
@@ -748,7 +748,7 @@
     </w:tbl>
     <w:p>
       <w:pPr>
-        <w:spacing w:after="20"/>
+        <w:spacing w:after="30"/>
         <w:ind w:left="259"/>
       </w:pPr>
       <w:r>
@@ -762,7 +762,7 @@
     </w:p>
     <w:p>
       <w:pPr>
-        <w:spacing w:after="30" w:line="252" w:lineRule="auto"/>
+        <w:spacing w:after="40" w:line="264" w:lineRule="auto"/>
         <w:ind w:left="259"/>
       </w:pPr>
       <w:r>
@@ -771,7 +771,7 @@
     </w:p>
     <w:p>
       <w:pPr>
-        <w:spacing w:after="30" w:line="252" w:lineRule="auto"/>
+        <w:spacing w:after="40" w:line="264" w:lineRule="auto"/>
         <w:ind w:left="259"/>
       </w:pPr>
       <w:r>
@@ -785,8 +785,8 @@
         <w:tblLook w:firstColumn="1" w:firstRow="1" w:lastColumn="0" w:lastRow="0" w:noHBand="0" w:noVBand="1" w:val="04A0"/>
       </w:tblPr>
       <w:tblGrid>
-        <w:gridCol w:w="5515"/>
-        <w:gridCol w:w="5515"/>
+        <w:gridCol w:w="5544"/>
+        <w:gridCol w:w="5544"/>
       </w:tblGrid>
       <w:tr>
         <w:tc>
@@ -800,7 +800,7 @@
             <w:r>
               <w:rPr>
                 <w:b/>
-                <w:sz w:val="17"/>
+                <w:sz w:val="18"/>
               </w:rPr>
               <w:t>•  Customer Churn &amp; Retention Analytics</w:t>
             </w:r>
@@ -830,7 +830,7 @@
     </w:tbl>
     <w:p>
       <w:pPr>
-        <w:spacing w:after="20"/>
+        <w:spacing w:after="30"/>
         <w:ind w:left="259"/>
       </w:pPr>
       <w:r>
@@ -844,7 +844,7 @@
     </w:p>
     <w:p>
       <w:pPr>
-        <w:spacing w:after="30" w:line="252" w:lineRule="auto"/>
+        <w:spacing w:after="40" w:line="264" w:lineRule="auto"/>
         <w:ind w:left="259"/>
       </w:pPr>
       <w:r>
@@ -853,7 +853,7 @@
     </w:p>
     <w:p>
       <w:pPr>
-        <w:spacing w:after="30" w:line="252" w:lineRule="auto"/>
+        <w:spacing w:after="40" w:line="264" w:lineRule="auto"/>
         <w:ind w:left="259"/>
       </w:pPr>
       <w:r>
@@ -867,8 +867,8 @@
         <w:tblLook w:firstColumn="1" w:firstRow="1" w:lastColumn="0" w:lastRow="0" w:noHBand="0" w:noVBand="1" w:val="04A0"/>
       </w:tblPr>
       <w:tblGrid>
-        <w:gridCol w:w="5515"/>
-        <w:gridCol w:w="5515"/>
+        <w:gridCol w:w="5544"/>
+        <w:gridCol w:w="5544"/>
       </w:tblGrid>
       <w:tr>
         <w:tc>
@@ -882,7 +882,7 @@
             <w:r>
               <w:rPr>
                 <w:b/>
-                <w:sz w:val="17"/>
+                <w:sz w:val="18"/>
               </w:rPr>
               <w:t>•  Noctra Grid Relay – Spreadsheet Automation &amp; Analytics Platform</w:t>
             </w:r>
@@ -912,7 +912,7 @@
     </w:tbl>
     <w:p>
       <w:pPr>
-        <w:spacing w:after="20"/>
+        <w:spacing w:after="30"/>
         <w:ind w:left="259"/>
       </w:pPr>
       <w:r>
@@ -926,7 +926,7 @@
     </w:p>
     <w:p>
       <w:pPr>
-        <w:spacing w:after="30" w:line="252" w:lineRule="auto"/>
+        <w:spacing w:after="40" w:line="264" w:lineRule="auto"/>
         <w:ind w:left="259"/>
       </w:pPr>
       <w:r>
@@ -935,7 +935,7 @@
     </w:p>
     <w:p>
       <w:pPr>
-        <w:spacing w:after="30" w:line="252" w:lineRule="auto"/>
+        <w:spacing w:after="40" w:line="264" w:lineRule="auto"/>
         <w:ind w:left="259"/>
       </w:pPr>
       <w:r>
@@ -944,7 +944,7 @@
     </w:p>
     <w:p>
       <w:pPr>
-        <w:spacing w:before="100" w:after="40" w:line="240" w:lineRule="auto"/>
+        <w:spacing w:before="120" w:after="50" w:line="240" w:lineRule="auto"/>
         <w:pBdr>
           <w:bottom w:val="single" w:sz="6" w:space="2" w:color="0F172A"/>
         </w:pBdr>
@@ -953,14 +953,14 @@
         <w:rPr>
           <w:b/>
           <w:color w:val="0F172A"/>
-          <w:sz w:val="20"/>
+          <w:sz w:val="21"/>
         </w:rPr>
         <w:t>Certifications</w:t>
       </w:r>
     </w:p>
     <w:p>
       <w:pPr>
-        <w:spacing w:after="30" w:line="252" w:lineRule="auto"/>
+        <w:spacing w:after="40" w:line="264" w:lineRule="auto"/>
         <w:ind w:left="259"/>
       </w:pPr>
       <w:r>
@@ -972,7 +972,7 @@
     </w:p>
     <w:p>
       <w:pPr>
-        <w:spacing w:after="30" w:line="252" w:lineRule="auto"/>
+        <w:spacing w:after="40" w:line="264" w:lineRule="auto"/>
         <w:ind w:left="259"/>
       </w:pPr>
       <w:r>
@@ -984,7 +984,7 @@
     </w:p>
     <w:p>
       <w:pPr>
-        <w:spacing w:after="30" w:line="252" w:lineRule="auto"/>
+        <w:spacing w:after="40" w:line="264" w:lineRule="auto"/>
         <w:ind w:left="259"/>
       </w:pPr>
       <w:r>
@@ -996,7 +996,7 @@
     </w:p>
     <w:p>
       <w:pPr>
-        <w:spacing w:after="30" w:line="252" w:lineRule="auto"/>
+        <w:spacing w:after="40" w:line="264" w:lineRule="auto"/>
         <w:ind w:left="259"/>
       </w:pPr>
       <w:r>
@@ -1008,7 +1008,7 @@
     </w:p>
     <w:sectPr>
       <w:pgSz w:w="12240" w:h="15840"/>
-      <w:pgMar w:top="504" w:right="605" w:bottom="504" w:left="605" w:header="720" w:footer="720" w:gutter="0"/>
+      <w:pgMar w:top="403" w:right="576" w:bottom="403" w:left="576" w:header="720" w:footer="720" w:gutter="0"/>
       <w:cols w:space="720"/>
       <w:docGrid w:linePitch="360"/>
     </w:sectPr>

</xml_diff>

<commit_message>
feat: group Python & SQL first followed by Power BI & Excel, and generate 100% native editable Word document
</commit_message>
<xml_diff>
--- a/frontend/public/resume/Gaurav_Data_Analyst_Resume.docx
+++ b/frontend/public/resume/Gaurav_Data_Analyst_Resume.docx
@@ -10,13 +10,13 @@
         <w:tblLook w:firstColumn="1" w:firstRow="1" w:lastColumn="0" w:lastRow="0" w:noHBand="0" w:noVBand="1" w:val="04A0"/>
       </w:tblPr>
       <w:tblGrid>
-        <w:gridCol w:w="5544"/>
-        <w:gridCol w:w="5544"/>
+        <w:gridCol w:w="5616"/>
+        <w:gridCol w:w="5616"/>
       </w:tblGrid>
       <w:tr>
         <w:tc>
           <w:tcPr>
-            <w:tcW w:type="dxa" w:w="6624"/>
+            <w:tcW w:type="dxa" w:w="6480"/>
           </w:tcPr>
           <w:p>
             <w:pPr>
@@ -25,8 +25,8 @@
             <w:r>
               <w:rPr>
                 <w:b/>
-                <w:color w:val="0B2545"/>
-                <w:sz w:val="42"/>
+                <w:color w:val="0F2744"/>
+                <w:sz w:val="44"/>
               </w:rPr>
               <w:t>Gaurav</w:t>
               <w:br/>
@@ -34,8 +34,8 @@
             <w:r>
               <w:rPr>
                 <w:b/>
-                <w:color w:val="1D4ED8"/>
-                <w:sz w:val="22"/>
+                <w:color w:val="111827"/>
+                <w:sz w:val="23"/>
               </w:rPr>
               <w:t>Data Analyst &amp; Analytics Engineer</w:t>
             </w:r>
@@ -43,7 +43,7 @@
         </w:tc>
         <w:tc>
           <w:tcPr>
-            <w:tcW w:type="dxa" w:w="4464"/>
+            <w:tcW w:type="dxa" w:w="4752"/>
           </w:tcPr>
           <w:p>
             <w:pPr>
@@ -53,14 +53,14 @@
             <w:r>
               <w:rPr>
                 <w:b/>
-                <w:sz w:val="18"/>
+                <w:sz w:val="19"/>
               </w:rPr>
-              <w:t xml:space="preserve">My Portfolio: </w:t>
+              <w:t xml:space="preserve">| My Portfolio: </w:t>
             </w:r>
             <w:hyperlink r:id="rId9">
               <w:r>
                 <w:rPr>
-                  <w:color w:val="0044CC"/>
+                  <w:color w:val="1A56DB"/>
                   <w:u w:val="single"/>
                 </w:rPr>
                 <w:t>gauravdataanalyst.onrender.com</w:t>
@@ -75,36 +75,36 @@
         <w:spacing w:before="60" w:after="40" w:line="240" w:lineRule="auto"/>
       </w:pPr>
       <w:r>
-        <w:t xml:space="preserve">+91 8307042798  |  </w:t>
+        <w:t xml:space="preserve">📞 +91 8307042798  ✉ </w:t>
       </w:r>
       <w:hyperlink r:id="rId10">
         <w:r>
           <w:rPr>
-            <w:color w:val="0044CC"/>
+            <w:color w:val="1A56DB"/>
             <w:u w:val="single"/>
           </w:rPr>
           <w:t>gaurav94855@gmail.com</w:t>
         </w:r>
       </w:hyperlink>
       <w:r>
-        <w:t xml:space="preserve">  |  </w:t>
+        <w:t xml:space="preserve">  in </w:t>
       </w:r>
       <w:hyperlink r:id="rId11">
         <w:r>
           <w:rPr>
-            <w:color w:val="0044CC"/>
+            <w:color w:val="1A56DB"/>
             <w:u w:val="single"/>
           </w:rPr>
-          <w:t>linkedin.com/in/gaurav-chauhan-382ab0214</w:t>
+          <w:t>gaurav-chauhan-382ab0214</w:t>
         </w:r>
       </w:hyperlink>
       <w:r>
-        <w:t xml:space="preserve">  |  GitHub: </w:t>
+        <w:t xml:space="preserve">  GitHub: </w:t>
       </w:r>
       <w:hyperlink r:id="rId12">
         <w:r>
           <w:rPr>
-            <w:color w:val="0044CC"/>
+            <w:color w:val="1A56DB"/>
             <w:u w:val="single"/>
           </w:rPr>
           <w:t>GauravChauhan00</w:t>
@@ -113,16 +113,16 @@
     </w:p>
     <w:p>
       <w:pPr>
-        <w:spacing w:before="120" w:after="50" w:line="240" w:lineRule="auto"/>
+        <w:spacing w:before="100" w:after="50" w:line="240" w:lineRule="auto"/>
         <w:pBdr>
-          <w:bottom w:val="single" w:sz="6" w:space="2" w:color="0F172A"/>
+          <w:bottom w:val="single" w:sz="6" w:space="2" w:color="1E3A8A"/>
         </w:pBdr>
       </w:pPr>
       <w:r>
         <w:rPr>
           <w:b/>
-          <w:color w:val="0F172A"/>
-          <w:sz w:val="21"/>
+          <w:color w:val="0F2744"/>
+          <w:sz w:val="23"/>
         </w:rPr>
         <w:t>Professional Summary</w:t>
       </w:r>
@@ -144,7 +144,7 @@
         <w:rPr>
           <w:b/>
         </w:rPr>
-        <w:t>SQL, Python (Pandas, NumPy, Matplotlib, Seaborn), Power BI, and Advanced Excel</w:t>
+        <w:t>SQL, PostgreSQL, Python (Pandas, NumPy, Matplotlib, Seaborn), Power BI, React.js, and Excel</w:t>
       </w:r>
       <w:r>
         <w:t xml:space="preserve"> with hands-on experience in </w:t>
@@ -161,16 +161,16 @@
     </w:p>
     <w:p>
       <w:pPr>
-        <w:spacing w:before="120" w:after="50" w:line="240" w:lineRule="auto"/>
+        <w:spacing w:before="100" w:after="50" w:line="240" w:lineRule="auto"/>
         <w:pBdr>
-          <w:bottom w:val="single" w:sz="6" w:space="2" w:color="0F172A"/>
+          <w:bottom w:val="single" w:sz="6" w:space="2" w:color="1E3A8A"/>
         </w:pBdr>
       </w:pPr>
       <w:r>
         <w:rPr>
           <w:b/>
-          <w:color w:val="0F172A"/>
-          <w:sz w:val="21"/>
+          <w:color w:val="0F2744"/>
+          <w:sz w:val="23"/>
         </w:rPr>
         <w:t>Professional Experience</w:t>
       </w:r>
@@ -182,13 +182,13 @@
         <w:tblLook w:firstColumn="1" w:firstRow="1" w:lastColumn="0" w:lastRow="0" w:noHBand="0" w:noVBand="1" w:val="04A0"/>
       </w:tblPr>
       <w:tblGrid>
-        <w:gridCol w:w="5544"/>
-        <w:gridCol w:w="5544"/>
+        <w:gridCol w:w="5616"/>
+        <w:gridCol w:w="5616"/>
       </w:tblGrid>
       <w:tr>
         <w:tc>
           <w:tcPr>
-            <w:tcW w:type="dxa" w:w="8208"/>
+            <w:tcW w:type="dxa" w:w="8352"/>
           </w:tcPr>
           <w:p>
             <w:pPr>
@@ -199,14 +199,7 @@
                 <w:b/>
                 <w:sz w:val="18"/>
               </w:rPr>
-              <w:t>Composio Technologies Private Limited</w:t>
-            </w:r>
-            <w:r>
-              <w:rPr>
-                <w:i/>
-                <w:sz w:val="18"/>
-              </w:rPr>
-              <w:t xml:space="preserve"> – QA / Data Validation &amp; Engineering</w:t>
+              <w:t>Composio Technologies Private Limited - QA / Data Validation</w:t>
             </w:r>
           </w:p>
         </w:tc>
@@ -224,7 +217,7 @@
                 <w:b/>
                 <w:color w:val="475569"/>
               </w:rPr>
-              <w:t>Sept 2025 – May 2026</w:t>
+              <w:t>Sept 2025 - May 2026</w:t>
             </w:r>
           </w:p>
         </w:tc>
@@ -232,20 +225,20 @@
     </w:tbl>
     <w:p>
       <w:pPr>
-        <w:spacing w:after="40" w:line="264" w:lineRule="auto"/>
+        <w:spacing w:after="36" w:line="269" w:lineRule="auto"/>
         <w:ind w:left="259"/>
       </w:pPr>
       <w:r>
-        <w:t>•  Tested and validated REST APIs, OAuth2 authentication flows, webhooks, and event-driven data integrations; verified JSON payload schemas and cross-system data consistency.</w:t>
+        <w:t>•  Tested REST APIs, OAuth2, webhooks, triggers and event-driven integrations; validated payloads, error handling, cross-system data flow and reporting consistency.</w:t>
       </w:r>
     </w:p>
     <w:p>
       <w:pPr>
-        <w:spacing w:after="40" w:line="264" w:lineRule="auto"/>
+        <w:spacing w:after="36" w:line="269" w:lineRule="auto"/>
         <w:ind w:left="259"/>
       </w:pPr>
       <w:r>
-        <w:t>•  Monitored microservice workflow executions, performed root-cause analysis on data pipeline failures, and designed comprehensive Postman test suites to ensure data reliability.</w:t>
+        <w:t>•  Monitored workflow failures, created manual test cases, identified defect patterns, and documented validation gaps, outcomes and root causes.</w:t>
       </w:r>
     </w:p>
     <w:tbl>
@@ -255,13 +248,13 @@
         <w:tblLook w:firstColumn="1" w:firstRow="1" w:lastColumn="0" w:lastRow="0" w:noHBand="0" w:noVBand="1" w:val="04A0"/>
       </w:tblPr>
       <w:tblGrid>
-        <w:gridCol w:w="5544"/>
-        <w:gridCol w:w="5544"/>
+        <w:gridCol w:w="5616"/>
+        <w:gridCol w:w="5616"/>
       </w:tblGrid>
       <w:tr>
         <w:tc>
           <w:tcPr>
-            <w:tcW w:type="dxa" w:w="8208"/>
+            <w:tcW w:type="dxa" w:w="8352"/>
           </w:tcPr>
           <w:p>
             <w:pPr>
@@ -272,14 +265,7 @@
                 <w:b/>
                 <w:sz w:val="18"/>
               </w:rPr>
-              <w:t>MuSigma Inc.</w:t>
-            </w:r>
-            <w:r>
-              <w:rPr>
-                <w:i/>
-                <w:sz w:val="18"/>
-              </w:rPr>
-              <w:t xml:space="preserve"> – Trainee Decision Scientist / Data Analyst</w:t>
+              <w:t>MuSigma Inc. - Trainee Decision Scientist</w:t>
             </w:r>
           </w:p>
         </w:tc>
@@ -297,7 +283,7 @@
                 <w:b/>
                 <w:color w:val="475569"/>
               </w:rPr>
-              <w:t>July 2025 – Aug 2025</w:t>
+              <w:t>July 2025 - Aug 2025</w:t>
             </w:r>
           </w:p>
         </w:tc>
@@ -305,16 +291,16 @@
     </w:tbl>
     <w:p>
       <w:pPr>
-        <w:spacing w:after="40" w:line="264" w:lineRule="auto"/>
+        <w:spacing w:after="36" w:line="269" w:lineRule="auto"/>
         <w:ind w:left="259"/>
       </w:pPr>
       <w:r>
-        <w:t>•  Leveraged Python (Pandas) and SQL for relational data extraction, cleaning, handling missing values, multi-table joins, and Exploratory Data Analysis (EDA).</w:t>
+        <w:t>•  Used Python and SQL for data cleaning, transformation, aggregation, EDA, validation, trend identification and business-insight generation.</w:t>
       </w:r>
     </w:p>
     <w:p>
       <w:pPr>
-        <w:spacing w:after="40" w:line="264" w:lineRule="auto"/>
+        <w:spacing w:after="36" w:line="269" w:lineRule="auto"/>
         <w:ind w:left="259"/>
       </w:pPr>
       <w:r>
@@ -323,16 +309,16 @@
     </w:p>
     <w:p>
       <w:pPr>
-        <w:spacing w:before="120" w:after="50" w:line="240" w:lineRule="auto"/>
+        <w:spacing w:before="100" w:after="50" w:line="240" w:lineRule="auto"/>
         <w:pBdr>
-          <w:bottom w:val="single" w:sz="6" w:space="2" w:color="0F172A"/>
+          <w:bottom w:val="single" w:sz="6" w:space="2" w:color="1E3A8A"/>
         </w:pBdr>
       </w:pPr>
       <w:r>
         <w:rPr>
           <w:b/>
-          <w:color w:val="0F172A"/>
-          <w:sz w:val="21"/>
+          <w:color w:val="0F2744"/>
+          <w:sz w:val="23"/>
         </w:rPr>
         <w:t>Education</w:t>
       </w:r>
@@ -344,14 +330,15 @@
         <w:tblLook w:firstColumn="1" w:firstRow="1" w:lastColumn="0" w:lastRow="0" w:noHBand="0" w:noVBand="1" w:val="04A0"/>
       </w:tblPr>
       <w:tblGrid>
-        <w:gridCol w:w="3696"/>
-        <w:gridCol w:w="3696"/>
-        <w:gridCol w:w="3696"/>
+        <w:gridCol w:w="2808"/>
+        <w:gridCol w:w="2808"/>
+        <w:gridCol w:w="2808"/>
+        <w:gridCol w:w="2808"/>
       </w:tblGrid>
       <w:tr>
         <w:tc>
           <w:tcPr>
-            <w:tcW w:type="dxa" w:w="6480"/>
+            <w:tcW w:type="dxa" w:w="3024"/>
           </w:tcPr>
           <w:p>
             <w:pPr>
@@ -362,13 +349,13 @@
                 <w:b/>
                 <w:sz w:val="17"/>
               </w:rPr>
-              <w:t>Bachelor of Engineering: Chandigarh University, Gharuan</w:t>
+              <w:t>Bachelor of Engineering:</w:t>
             </w:r>
           </w:p>
         </w:tc>
         <w:tc>
           <w:tcPr>
-            <w:tcW w:type="dxa" w:w="2592"/>
+            <w:tcW w:type="dxa" w:w="3744"/>
           </w:tcPr>
           <w:p>
             <w:pPr>
@@ -378,22 +365,36 @@
               <w:rPr>
                 <w:sz w:val="17"/>
               </w:rPr>
-              <w:t>Aug 2021 – May 2025</w:t>
+              <w:t>Chandigarh University, Gharuan</w:t>
             </w:r>
           </w:p>
         </w:tc>
         <w:tc>
           <w:tcPr>
-            <w:tcW w:type="dxa" w:w="2016"/>
+            <w:tcW w:type="dxa" w:w="2304"/>
           </w:tcPr>
           <w:p>
             <w:pPr>
               <w:spacing w:after="20"/>
-              <w:jc w:val="right"/>
             </w:pPr>
             <w:r>
               <w:rPr>
-                <w:b/>
+                <w:sz w:val="17"/>
+              </w:rPr>
+              <w:t>Aug 2021 - May 2025</w:t>
+            </w:r>
+          </w:p>
+        </w:tc>
+        <w:tc>
+          <w:tcPr>
+            <w:tcW w:type="dxa" w:w="2160"/>
+          </w:tcPr>
+          <w:p>
+            <w:pPr>
+              <w:spacing w:after="20"/>
+            </w:pPr>
+            <w:r>
+              <w:rPr>
                 <w:sz w:val="17"/>
               </w:rPr>
               <w:t>CGPA: 7.87</w:t>
@@ -404,7 +405,24 @@
       <w:tr>
         <w:tc>
           <w:tcPr>
-            <w:tcW w:type="dxa" w:w="6480"/>
+            <w:tcW w:type="dxa" w:w="3024"/>
+          </w:tcPr>
+          <w:p>
+            <w:pPr>
+              <w:spacing w:after="20"/>
+            </w:pPr>
+            <w:r>
+              <w:rPr>
+                <w:b/>
+                <w:sz w:val="17"/>
+              </w:rPr>
+              <w:t>Intermediate (HBSE):</w:t>
+            </w:r>
+          </w:p>
+        </w:tc>
+        <w:tc>
+          <w:tcPr>
+            <w:tcW w:type="dxa" w:w="3744"/>
           </w:tcPr>
           <w:p>
             <w:pPr>
@@ -414,13 +432,13 @@
               <w:rPr>
                 <w:sz w:val="17"/>
               </w:rPr>
-              <w:t>Intermediate (HBSE): Barwala Public Sr. Sec. School, Hisar</w:t>
+              <w:t>Barwala Public Sr. Sec. School, Hisar</w:t>
             </w:r>
           </w:p>
         </w:tc>
         <w:tc>
           <w:tcPr>
-            <w:tcW w:type="dxa" w:w="2592"/>
+            <w:tcW w:type="dxa" w:w="2304"/>
           </w:tcPr>
           <w:p>
             <w:pPr>
@@ -436,16 +454,14 @@
         </w:tc>
         <w:tc>
           <w:tcPr>
-            <w:tcW w:type="dxa" w:w="2016"/>
+            <w:tcW w:type="dxa" w:w="2160"/>
           </w:tcPr>
           <w:p>
             <w:pPr>
               <w:spacing w:after="20"/>
-              <w:jc w:val="right"/>
             </w:pPr>
             <w:r>
               <w:rPr>
-                <w:b/>
                 <w:sz w:val="17"/>
               </w:rPr>
               <w:t>Percentage: 89%</w:t>
@@ -456,7 +472,24 @@
       <w:tr>
         <w:tc>
           <w:tcPr>
-            <w:tcW w:type="dxa" w:w="6480"/>
+            <w:tcW w:type="dxa" w:w="3024"/>
+          </w:tcPr>
+          <w:p>
+            <w:pPr>
+              <w:spacing w:after="20"/>
+            </w:pPr>
+            <w:r>
+              <w:rPr>
+                <w:b/>
+                <w:sz w:val="17"/>
+              </w:rPr>
+              <w:t>Matriculation (CBSE):</w:t>
+            </w:r>
+          </w:p>
+        </w:tc>
+        <w:tc>
+          <w:tcPr>
+            <w:tcW w:type="dxa" w:w="3744"/>
           </w:tcPr>
           <w:p>
             <w:pPr>
@@ -466,13 +499,13 @@
               <w:rPr>
                 <w:sz w:val="17"/>
               </w:rPr>
-              <w:t>Matriculation (CBSE): Army Public School, Hisar Cantt</w:t>
+              <w:t>Army Public School, Hisar Cantt</w:t>
             </w:r>
           </w:p>
         </w:tc>
         <w:tc>
           <w:tcPr>
-            <w:tcW w:type="dxa" w:w="2592"/>
+            <w:tcW w:type="dxa" w:w="2304"/>
           </w:tcPr>
           <w:p>
             <w:pPr>
@@ -488,16 +521,14 @@
         </w:tc>
         <w:tc>
           <w:tcPr>
-            <w:tcW w:type="dxa" w:w="2016"/>
+            <w:tcW w:type="dxa" w:w="2160"/>
           </w:tcPr>
           <w:p>
             <w:pPr>
               <w:spacing w:after="20"/>
-              <w:jc w:val="right"/>
             </w:pPr>
             <w:r>
               <w:rPr>
-                <w:b/>
                 <w:sz w:val="17"/>
               </w:rPr>
               <w:t>Percentage: 70.2%</w:t>
@@ -508,23 +539,23 @@
     </w:tbl>
     <w:p>
       <w:pPr>
-        <w:spacing w:before="120" w:after="50" w:line="240" w:lineRule="auto"/>
+        <w:spacing w:before="100" w:after="50" w:line="240" w:lineRule="auto"/>
         <w:pBdr>
-          <w:bottom w:val="single" w:sz="6" w:space="2" w:color="0F172A"/>
+          <w:bottom w:val="single" w:sz="6" w:space="2" w:color="1E3A8A"/>
         </w:pBdr>
       </w:pPr>
       <w:r>
         <w:rPr>
           <w:b/>
-          <w:color w:val="0F172A"/>
-          <w:sz w:val="21"/>
+          <w:color w:val="0F2744"/>
+          <w:sz w:val="23"/>
         </w:rPr>
         <w:t>Technical Skills</w:t>
       </w:r>
     </w:p>
     <w:p>
       <w:pPr>
-        <w:spacing w:after="40" w:line="264" w:lineRule="auto"/>
+        <w:spacing w:after="36" w:line="269" w:lineRule="auto"/>
         <w:ind w:left="259"/>
       </w:pPr>
       <w:r>
@@ -532,18 +563,18 @@
           <w:b/>
           <w:sz w:val="17"/>
         </w:rPr>
-        <w:t>•  Programming &amp; Scripting:</w:t>
+        <w:t>•  Frontend &amp; Web:</w:t>
       </w:r>
       <w:r>
         <w:rPr>
           <w:sz w:val="17"/>
         </w:rPr>
-        <w:t xml:space="preserve"> Python (Pandas, NumPy, Matplotlib, Seaborn), SQL, PostgreSQL, SQLite</w:t>
+        <w:t xml:space="preserve"> React.js, Vite, HTML5, CSS3, JavaScript, REST APIs, Responsive Web Design</w:t>
       </w:r>
     </w:p>
     <w:p>
       <w:pPr>
-        <w:spacing w:after="40" w:line="264" w:lineRule="auto"/>
+        <w:spacing w:after="36" w:line="269" w:lineRule="auto"/>
         <w:ind w:left="259"/>
       </w:pPr>
       <w:r>
@@ -551,18 +582,18 @@
           <w:b/>
           <w:sz w:val="17"/>
         </w:rPr>
-        <w:t>•  Data Analytics &amp; BI:</w:t>
+        <w:t>•  Programming &amp; Database:</w:t>
       </w:r>
       <w:r>
         <w:rPr>
           <w:sz w:val="17"/>
         </w:rPr>
-        <w:t xml:space="preserve"> Power BI (DAX Measures, Data Modeling), Tableau Desktop, Advanced Excel (VLOOKUP, Pivot Tables)</w:t>
+        <w:t xml:space="preserve"> Python (Pandas, NumPy, Matplotlib, Seaborn), SQL, PostgreSQL (Joins, CTEs, Window Functions)</w:t>
       </w:r>
     </w:p>
     <w:p>
       <w:pPr>
-        <w:spacing w:after="40" w:line="264" w:lineRule="auto"/>
+        <w:spacing w:after="36" w:line="269" w:lineRule="auto"/>
         <w:ind w:left="259"/>
       </w:pPr>
       <w:r>
@@ -570,18 +601,18 @@
           <w:b/>
           <w:sz w:val="17"/>
         </w:rPr>
-        <w:t>•  Databases &amp; Querying:</w:t>
+        <w:t>•  Data &amp; BI Analytics:</w:t>
       </w:r>
       <w:r>
         <w:rPr>
           <w:sz w:val="17"/>
         </w:rPr>
-        <w:t xml:space="preserve"> PostgreSQL, MySQL, SQLite, Joins, Aggregations, Group By, Subqueries, Window Functions, CTEs</w:t>
+        <w:t xml:space="preserve"> Power BI (DAX Measures, Data Modeling, Dashboards), Excel (VLOOKUP, Pivot Tables, Power Query), EDA, ETL</w:t>
       </w:r>
     </w:p>
     <w:p>
       <w:pPr>
-        <w:spacing w:after="40" w:line="264" w:lineRule="auto"/>
+        <w:spacing w:after="36" w:line="269" w:lineRule="auto"/>
         <w:ind w:left="259"/>
       </w:pPr>
       <w:r>
@@ -589,27 +620,27 @@
           <w:b/>
           <w:sz w:val="17"/>
         </w:rPr>
-        <w:t>•  Validation, Testing &amp; Tools:</w:t>
+        <w:t>•  QA, Tools &amp; Deployment:</w:t>
       </w:r>
       <w:r>
         <w:rPr>
           <w:sz w:val="17"/>
         </w:rPr>
-        <w:t xml:space="preserve"> Data Cleaning, ETL Pipelines, EDA, API Testing (Postman), JSON Schemas, GitHub, Jupyter</w:t>
+        <w:t xml:space="preserve"> API Testing, Manual Testing, Postman, GitHub, Jupyter, Render</w:t>
       </w:r>
     </w:p>
     <w:p>
       <w:pPr>
-        <w:spacing w:before="120" w:after="50" w:line="240" w:lineRule="auto"/>
+        <w:spacing w:before="100" w:after="50" w:line="240" w:lineRule="auto"/>
         <w:pBdr>
-          <w:bottom w:val="single" w:sz="6" w:space="2" w:color="0F172A"/>
+          <w:bottom w:val="single" w:sz="6" w:space="2" w:color="1E3A8A"/>
         </w:pBdr>
       </w:pPr>
       <w:r>
         <w:rPr>
           <w:b/>
-          <w:color w:val="0F172A"/>
-          <w:sz w:val="21"/>
+          <w:color w:val="0F2744"/>
+          <w:sz w:val="23"/>
         </w:rPr>
         <w:t>Projects</w:t>
       </w:r>
@@ -621,8 +652,8 @@
         <w:tblLook w:firstColumn="1" w:firstRow="1" w:lastColumn="0" w:lastRow="0" w:noHBand="0" w:noVBand="1" w:val="04A0"/>
       </w:tblPr>
       <w:tblGrid>
-        <w:gridCol w:w="5544"/>
-        <w:gridCol w:w="5544"/>
+        <w:gridCol w:w="5616"/>
+        <w:gridCol w:w="5616"/>
       </w:tblGrid>
       <w:tr>
         <w:tc>
@@ -644,7 +675,7 @@
         </w:tc>
         <w:tc>
           <w:tcPr>
-            <w:tcW w:type="dxa" w:w="2592"/>
+            <w:tcW w:type="dxa" w:w="2736"/>
           </w:tcPr>
           <w:p>
             <w:pPr>
@@ -654,7 +685,7 @@
             <w:hyperlink r:id="rId13">
               <w:r>
                 <w:rPr>
-                  <w:color w:val="0044CC"/>
+                  <w:color w:val="1A56DB"/>
                   <w:u w:val="single"/>
                 </w:rPr>
                 <w:t>GitHub Repository</w:t>
@@ -671,29 +702,29 @@
       </w:pPr>
       <w:r>
         <w:rPr>
+          <w:b/>
+          <w:sz w:val="17"/>
+        </w:rPr>
+        <w:t xml:space="preserve">Tech: </w:t>
+      </w:r>
+      <w:r>
+        <w:rPr>
           <w:i/>
-          <w:color w:val="475569"/>
-          <w:sz w:val="16"/>
+          <w:sz w:val="17"/>
         </w:rPr>
-        <w:t>Tech: Python, Pandas, PostgreSQL, SQL, Power BI, DAX, Seaborn, Jupyter Notebook</w:t>
+        <w:t>Python, Pandas, PostgreSQL, SQL, Power BI, DAX, Seaborn, Jupyter Notebook</w:t>
       </w:r>
     </w:p>
     <w:p>
       <w:pPr>
-        <w:spacing w:after="40" w:line="264" w:lineRule="auto"/>
+        <w:spacing w:after="40" w:line="269" w:lineRule="auto"/>
         <w:ind w:left="259"/>
       </w:pPr>
       <w:r>
-        <w:t>•  Cleaned &amp; analyzed 31,000+ sales transactions ($8.35M GMV) to evaluate customer orders, revenue trends, and product performance.</w:t>
-      </w:r>
-    </w:p>
-    <w:p>
-      <w:pPr>
-        <w:spacing w:after="40" w:line="264" w:lineRule="auto"/>
-        <w:ind w:left="259"/>
-      </w:pPr>
-      <w:r>
-        <w:t>•  Built an interactive Power BI dashboard with 25+ DAX measures (YTD Revenue, MoM Growth %, AOV) tracking discount margin impacts.</w:t>
+        <w:rPr>
+          <w:sz w:val="17"/>
+        </w:rPr>
+        <w:t>Cleaned and analyzed 31,000+ transactions ($8.35M GMV) to evaluate customer retention, product revenue, and discount impacts; built an interactive Power BI dashboard with 25+ DAX measures (YTD Revenue, MoM Growth %, AOV) tracking profit margin erosion.</w:t>
       </w:r>
     </w:p>
     <w:tbl>
@@ -703,8 +734,8 @@
         <w:tblLook w:firstColumn="1" w:firstRow="1" w:lastColumn="0" w:lastRow="0" w:noHBand="0" w:noVBand="1" w:val="04A0"/>
       </w:tblPr>
       <w:tblGrid>
-        <w:gridCol w:w="5544"/>
-        <w:gridCol w:w="5544"/>
+        <w:gridCol w:w="5616"/>
+        <w:gridCol w:w="5616"/>
       </w:tblGrid>
       <w:tr>
         <w:tc>
@@ -726,7 +757,7 @@
         </w:tc>
         <w:tc>
           <w:tcPr>
-            <w:tcW w:type="dxa" w:w="2592"/>
+            <w:tcW w:type="dxa" w:w="2736"/>
           </w:tcPr>
           <w:p>
             <w:pPr>
@@ -736,7 +767,7 @@
             <w:hyperlink r:id="rId14">
               <w:r>
                 <w:rPr>
-                  <w:color w:val="0044CC"/>
+                  <w:color w:val="1A56DB"/>
                   <w:u w:val="single"/>
                 </w:rPr>
                 <w:t>GitHub Repository</w:t>
@@ -753,29 +784,29 @@
       </w:pPr>
       <w:r>
         <w:rPr>
+          <w:b/>
+          <w:sz w:val="17"/>
+        </w:rPr>
+        <w:t xml:space="preserve">Tech: </w:t>
+      </w:r>
+      <w:r>
+        <w:rPr>
           <w:i/>
-          <w:color w:val="475569"/>
-          <w:sz w:val="16"/>
+          <w:sz w:val="17"/>
         </w:rPr>
-        <w:t>Tech: Python, Pandas, PostgreSQL, SQL, Power BI, DAX, Matplotlib, Industrial IoT</w:t>
+        <w:t>Python, Pandas, PostgreSQL, SQL, Power BI, DAX, Matplotlib, Industrial IoT</w:t>
       </w:r>
     </w:p>
     <w:p>
       <w:pPr>
-        <w:spacing w:after="40" w:line="264" w:lineRule="auto"/>
+        <w:spacing w:after="40" w:line="269" w:lineRule="auto"/>
         <w:ind w:left="259"/>
       </w:pPr>
       <w:r>
-        <w:t>•  Analyzed 8,700+ production shift records (3.2M+ units) to evaluate machine downtime, defect scrap rates, and plant OEE efficiency.</w:t>
-      </w:r>
-    </w:p>
-    <w:p>
-      <w:pPr>
-        <w:spacing w:after="40" w:line="264" w:lineRule="auto"/>
-        <w:ind w:left="259"/>
-      </w:pPr>
-      <w:r>
-        <w:t>•  Conducted Pareto downtime analysis and correlated vibration/temperature spikes with scrap defects; built Power BI plant KPI reports.</w:t>
+        <w:rPr>
+          <w:sz w:val="17"/>
+        </w:rPr>
+        <w:t>Analyzed 8,700+ production shift records (3.2M+ units) to evaluate machine downtime, defect scrap rates, and plant OEE efficiency; conducted Pareto downtime analysis, correlated vibration spikes with defects, and built Power BI plant KPI reports.</w:t>
       </w:r>
     </w:p>
     <w:tbl>
@@ -785,8 +816,8 @@
         <w:tblLook w:firstColumn="1" w:firstRow="1" w:lastColumn="0" w:lastRow="0" w:noHBand="0" w:noVBand="1" w:val="04A0"/>
       </w:tblPr>
       <w:tblGrid>
-        <w:gridCol w:w="5544"/>
-        <w:gridCol w:w="5544"/>
+        <w:gridCol w:w="5616"/>
+        <w:gridCol w:w="5616"/>
       </w:tblGrid>
       <w:tr>
         <w:tc>
@@ -808,7 +839,7 @@
         </w:tc>
         <w:tc>
           <w:tcPr>
-            <w:tcW w:type="dxa" w:w="2592"/>
+            <w:tcW w:type="dxa" w:w="2736"/>
           </w:tcPr>
           <w:p>
             <w:pPr>
@@ -818,7 +849,7 @@
             <w:hyperlink r:id="rId15">
               <w:r>
                 <w:rPr>
-                  <w:color w:val="0044CC"/>
+                  <w:color w:val="1A56DB"/>
                   <w:u w:val="single"/>
                 </w:rPr>
                 <w:t>GitHub Repository</w:t>
@@ -835,29 +866,29 @@
       </w:pPr>
       <w:r>
         <w:rPr>
+          <w:b/>
+          <w:sz w:val="17"/>
+        </w:rPr>
+        <w:t xml:space="preserve">Tech: </w:t>
+      </w:r>
+      <w:r>
+        <w:rPr>
           <w:i/>
-          <w:color w:val="475569"/>
-          <w:sz w:val="16"/>
+          <w:sz w:val="17"/>
         </w:rPr>
-        <w:t>Tech: Python, Pandas, Scikit-Learn, PostgreSQL, SQL, Power BI, DAX</w:t>
+        <w:t>Python, Pandas, Scikit-Learn, PostgreSQL, SQL, Power BI, DAX</w:t>
       </w:r>
     </w:p>
     <w:p>
       <w:pPr>
-        <w:spacing w:after="40" w:line="264" w:lineRule="auto"/>
+        <w:spacing w:after="40" w:line="269" w:lineRule="auto"/>
         <w:ind w:left="259"/>
       </w:pPr>
       <w:r>
-        <w:t>•  Analyzed 25,000 subscriber records to identify key churn drivers, contract renewal patterns, support ticket impact, and retention metrics.</w:t>
-      </w:r>
-    </w:p>
-    <w:p>
-      <w:pPr>
-        <w:spacing w:after="40" w:line="264" w:lineRule="auto"/>
-        <w:ind w:left="259"/>
-      </w:pPr>
-      <w:r>
-        <w:t>•  Created monthly cohort retention matrices and built Power BI retention dashboards protecting $8.14M in Annualized Revenue at Risk.</w:t>
+        <w:rPr>
+          <w:sz w:val="17"/>
+        </w:rPr>
+        <w:t>Analyzed 25,000 subscriber records to uncover customer churn drivers, contract renewal patterns, and support ticket frequency impact; developed monthly cohort retention matrices and built Power BI dashboards protecting $8.14M in Annualized Revenue at Risk.</w:t>
       </w:r>
     </w:p>
     <w:tbl>
@@ -867,8 +898,8 @@
         <w:tblLook w:firstColumn="1" w:firstRow="1" w:lastColumn="0" w:lastRow="0" w:noHBand="0" w:noVBand="1" w:val="04A0"/>
       </w:tblPr>
       <w:tblGrid>
-        <w:gridCol w:w="5544"/>
-        <w:gridCol w:w="5544"/>
+        <w:gridCol w:w="5616"/>
+        <w:gridCol w:w="5616"/>
       </w:tblGrid>
       <w:tr>
         <w:tc>
@@ -884,13 +915,13 @@
                 <w:b/>
                 <w:sz w:val="18"/>
               </w:rPr>
-              <w:t>•  Noctra Grid Relay – Spreadsheet Automation &amp; Analytics Platform</w:t>
+              <w:t>•  Noctra Grid Relay – (Full-Stack Spreadsheet Automation Platform)</w:t>
             </w:r>
           </w:p>
         </w:tc>
         <w:tc>
           <w:tcPr>
-            <w:tcW w:type="dxa" w:w="2592"/>
+            <w:tcW w:type="dxa" w:w="2736"/>
           </w:tcPr>
           <w:p>
             <w:pPr>
@@ -900,7 +931,7 @@
             <w:hyperlink r:id="rId16">
               <w:r>
                 <w:rPr>
-                  <w:color w:val="0044CC"/>
+                  <w:color w:val="1A56DB"/>
                   <w:u w:val="single"/>
                 </w:rPr>
                 <w:t>GitHub Repository</w:t>
@@ -917,50 +948,62 @@
       </w:pPr>
       <w:r>
         <w:rPr>
+          <w:b/>
+          <w:sz w:val="17"/>
+        </w:rPr>
+        <w:t xml:space="preserve">Tech: </w:t>
+      </w:r>
+      <w:r>
+        <w:rPr>
           <w:i/>
-          <w:color w:val="475569"/>
-          <w:sz w:val="16"/>
+          <w:sz w:val="17"/>
         </w:rPr>
-        <w:t>Tech: Python, FastAPI, Pandas, PostgreSQL, React.js, JWT, REST APIs</w:t>
+        <w:t>React.js, Vite, FastAPI, PostgreSQL/SQLite, pandas, JWT, ReportLab, Vercel, Railway</w:t>
       </w:r>
     </w:p>
     <w:p>
       <w:pPr>
-        <w:spacing w:after="40" w:line="264" w:lineRule="auto"/>
+        <w:spacing w:after="40" w:line="269" w:lineRule="auto"/>
         <w:ind w:left="259"/>
       </w:pPr>
       <w:r>
-        <w:t>•  Developed a full-stack spreadsheet analytics tool to upload, validate, clean, and process tabular datasets (Excel/CSV) in real time.</w:t>
+        <w:rPr>
+          <w:sz w:val="17"/>
+        </w:rPr>
+        <w:t>Built a secure spreadsheet automation app enabling users to upload, preview, validate, clean, and process tabular datasets with instant browser rendering; engineered asynchronous FastAPI endpoints with Pandas and PostgreSQL for automated data validation and report generation.</w:t>
       </w:r>
     </w:p>
     <w:p>
       <w:pPr>
-        <w:spacing w:after="40" w:line="264" w:lineRule="auto"/>
-        <w:ind w:left="259"/>
-      </w:pPr>
-      <w:r>
-        <w:t>•  Engineered asynchronous FastAPI endpoints with Pandas and PostgreSQL for automated ETL data validation and dynamic CSV/PDF report exports.</w:t>
-      </w:r>
-    </w:p>
-    <w:p>
-      <w:pPr>
-        <w:spacing w:before="120" w:after="50" w:line="240" w:lineRule="auto"/>
+        <w:spacing w:before="100" w:after="50" w:line="240" w:lineRule="auto"/>
         <w:pBdr>
-          <w:bottom w:val="single" w:sz="6" w:space="2" w:color="0F172A"/>
+          <w:bottom w:val="single" w:sz="6" w:space="2" w:color="1E3A8A"/>
         </w:pBdr>
       </w:pPr>
       <w:r>
         <w:rPr>
           <w:b/>
-          <w:color w:val="0F172A"/>
-          <w:sz w:val="21"/>
+          <w:color w:val="0F2744"/>
+          <w:sz w:val="23"/>
         </w:rPr>
         <w:t>Certifications</w:t>
       </w:r>
     </w:p>
     <w:p>
       <w:pPr>
-        <w:spacing w:after="40" w:line="264" w:lineRule="auto"/>
+        <w:spacing w:after="36" w:line="269" w:lineRule="auto"/>
+        <w:ind w:left="259"/>
+      </w:pPr>
+      <w:r>
+        <w:rPr>
+          <w:sz w:val="17"/>
+        </w:rPr>
+        <w:t>•  Python for Data Science Professional Certificate – IBM</w:t>
+      </w:r>
+    </w:p>
+    <w:p>
+      <w:pPr>
+        <w:spacing w:after="36" w:line="269" w:lineRule="auto"/>
         <w:ind w:left="259"/>
       </w:pPr>
       <w:r>
@@ -972,31 +1015,19 @@
     </w:p>
     <w:p>
       <w:pPr>
-        <w:spacing w:after="40" w:line="264" w:lineRule="auto"/>
+        <w:spacing w:after="36" w:line="269" w:lineRule="auto"/>
         <w:ind w:left="259"/>
       </w:pPr>
       <w:r>
         <w:rPr>
           <w:sz w:val="17"/>
         </w:rPr>
-        <w:t>•  Data Visualization with Tableau Specialization (6-Course Specialization Track) – UC Davis / Coursera</w:t>
+        <w:t>•  Meta Front-End Developer Professional Certificate – META</w:t>
       </w:r>
     </w:p>
     <w:p>
       <w:pPr>
-        <w:spacing w:after="40" w:line="264" w:lineRule="auto"/>
-        <w:ind w:left="259"/>
-      </w:pPr>
-      <w:r>
-        <w:rPr>
-          <w:sz w:val="17"/>
-        </w:rPr>
-        <w:t>•  Python for Data Science Professional Certificate – IBM / Coursera</w:t>
-      </w:r>
-    </w:p>
-    <w:p>
-      <w:pPr>
-        <w:spacing w:after="40" w:line="264" w:lineRule="auto"/>
+        <w:spacing w:after="36" w:line="269" w:lineRule="auto"/>
         <w:ind w:left="259"/>
       </w:pPr>
       <w:r>
@@ -1008,7 +1039,7 @@
     </w:p>
     <w:sectPr>
       <w:pgSz w:w="12240" w:h="15840"/>
-      <w:pgMar w:top="403" w:right="576" w:bottom="403" w:left="576" w:header="720" w:footer="720" w:gutter="0"/>
+      <w:pgMar w:top="360" w:right="504" w:bottom="360" w:left="504" w:header="720" w:footer="720" w:gutter="0"/>
       <w:cols w:space="720"/>
       <w:docGrid w:linePitch="360"/>
     </w:sectPr>
@@ -1382,7 +1413,7 @@
     <w:rPr>
       <w:rFonts w:ascii="Arial" w:hAnsi="Arial"/>
       <w:color w:val="1E293B"/>
-      <w:sz w:val="17"/>
+      <w:sz w:val="18"/>
     </w:rPr>
   </w:style>
   <w:style w:type="paragraph" w:styleId="Header">

</xml_diff>

<commit_message>
feat: align Technical Skills under Data & BI with Python -> SQL -> Power BI -> Excel sequence in both PDF and Word DOCX
</commit_message>
<xml_diff>
--- a/frontend/public/resume/Gaurav_Data_Analyst_Resume.docx
+++ b/frontend/public/resume/Gaurav_Data_Analyst_Resume.docx
@@ -144,7 +144,7 @@
         <w:rPr>
           <w:b/>
         </w:rPr>
-        <w:t>SQL, PostgreSQL, Python (Pandas, NumPy, Matplotlib, Seaborn), Power BI, React.js, and Excel</w:t>
+        <w:t>Python (Pandas, NumPy, Matplotlib, Seaborn), SQL, PostgreSQL, Power BI, React.js, and Excel</w:t>
       </w:r>
       <w:r>
         <w:t xml:space="preserve"> with hands-on experience in </w:t>
@@ -582,32 +582,13 @@
           <w:b/>
           <w:sz w:val="17"/>
         </w:rPr>
-        <w:t>•  Programming &amp; Database:</w:t>
+        <w:t>•  Data &amp; BI:</w:t>
       </w:r>
       <w:r>
         <w:rPr>
           <w:sz w:val="17"/>
         </w:rPr>
-        <w:t xml:space="preserve"> Python (Pandas, NumPy, Matplotlib, Seaborn), SQL, PostgreSQL (Joins, CTEs, Window Functions)</w:t>
-      </w:r>
-    </w:p>
-    <w:p>
-      <w:pPr>
-        <w:spacing w:after="36" w:line="269" w:lineRule="auto"/>
-        <w:ind w:left="259"/>
-      </w:pPr>
-      <w:r>
-        <w:rPr>
-          <w:b/>
-          <w:sz w:val="17"/>
-        </w:rPr>
-        <w:t>•  Data &amp; BI Analytics:</w:t>
-      </w:r>
-      <w:r>
-        <w:rPr>
-          <w:sz w:val="17"/>
-        </w:rPr>
-        <w:t xml:space="preserve"> Power BI (DAX Measures, Data Modeling, Dashboards), Excel (VLOOKUP, Pivot Tables, Power Query), EDA, ETL</w:t>
+        <w:t xml:space="preserve"> Python (Pandas, NumPy, Matplotlib, Seaborn), SQL, PostgreSQL (Joins, CTEs, Window Functions), Power BI (DAX Measures, Data Modeling, Dashboard Design), Excel (VLOOKUP, Pivot Tables, Power Query), Data Cleaning, EDA, ETL</w:t>
       </w:r>
     </w:p>
     <w:p>

</xml_diff>

<commit_message>
feat: place Power BI & Excel on clean indented sub-line under Data & BI with enhanced spacing and matched typography
</commit_message>
<xml_diff>
--- a/frontend/public/resume/Gaurav_Data_Analyst_Resume.docx
+++ b/frontend/public/resume/Gaurav_Data_Analyst_Resume.docx
@@ -563,13 +563,13 @@
           <w:b/>
           <w:sz w:val="17"/>
         </w:rPr>
-        <w:t>•  Frontend &amp; Web:</w:t>
+        <w:t xml:space="preserve">•  Frontend &amp; Web: </w:t>
       </w:r>
       <w:r>
         <w:rPr>
           <w:sz w:val="17"/>
         </w:rPr>
-        <w:t xml:space="preserve"> React.js, Vite, HTML5, CSS3, JavaScript, REST APIs, Responsive Web Design</w:t>
+        <w:t>React.js, Vite, HTML5, CSS3, JavaScript, REST APIs, Responsive Web Design</w:t>
       </w:r>
     </w:p>
     <w:p>
@@ -582,13 +582,15 @@
           <w:b/>
           <w:sz w:val="17"/>
         </w:rPr>
-        <w:t>•  Data &amp; BI:</w:t>
+        <w:t xml:space="preserve">•  Data &amp; BI: </w:t>
       </w:r>
       <w:r>
         <w:rPr>
           <w:sz w:val="17"/>
         </w:rPr>
-        <w:t xml:space="preserve"> Python (Pandas, NumPy, Matplotlib, Seaborn), SQL, PostgreSQL (Joins, CTEs, Window Functions), Power BI (DAX Measures, Data Modeling, Dashboard Design), Excel (VLOOKUP, Pivot Tables, Power Query), Data Cleaning, EDA, ETL</w:t>
+        <w:t>Python (Pandas, NumPy, Matplotlib, Seaborn), SQL, PostgreSQL (Joins, CTEs, Window Functions)</w:t>
+        <w:br/>
+        <w:t>Power BI (DAX Measures, Data Modeling, Dashboard Design), Excel (VLOOKUP, Pivot Tables, Power Query), EDA, ETL</w:t>
       </w:r>
     </w:p>
     <w:p>
@@ -601,13 +603,13 @@
           <w:b/>
           <w:sz w:val="17"/>
         </w:rPr>
-        <w:t>•  QA, Tools &amp; Deployment:</w:t>
+        <w:t xml:space="preserve">•  QA, Tools &amp; Deployment: </w:t>
       </w:r>
       <w:r>
         <w:rPr>
           <w:sz w:val="17"/>
         </w:rPr>
-        <w:t xml:space="preserve"> API Testing, Manual Testing, Postman, GitHub, Jupyter, Render</w:t>
+        <w:t>API Testing, Manual Testing, Postman, GitHub, Jupyter, Render</w:t>
       </w:r>
     </w:p>
     <w:p>

</xml_diff>